<commit_message>
court(fladistctapp5): opening-brief footnote clearance 7.5 for Word's footnote area (docx page ends 15 to 3 apart); latex still gated, docx reported (fb-595.54.41)
Co-Authored-By: Claude Opus 5.5 <noreply@anthropic.com>
</commit_message>
<xml_diff>
--- a/courts/eleventh-circuit/florida/state/fifth-district-court-of-appeal/opening-brief/usage/OUTPUT-opening-brief.docx
+++ b/courts/eleventh-circuit/florida/state/fifth-district-court-of-appeal/opening-brief/usage/OUTPUT-opening-brief.docx
@@ -4173,7 +4173,7 @@
         <w:tab/>
       </w:r>
       <w:r>
-        <w:t xml:space="preserve">20</w:t>
+        <w:t xml:space="preserve">20, 21</w:t>
       </w:r>
     </w:p>
     <w:p>
@@ -9267,7 +9267,7 @@
                     <w:rPr>
                       <w:u w:val="single"/>
                     </w:rPr>
-                    <w:t xml:space="preserve"> </w:t>
+                    <w:t xml:space="preserve"> </w:t>
                   </w:r>
                   <w:r>
                     <w:rPr>
@@ -10175,7 +10175,7 @@
               <w:rPr>
                 <w:u w:val="single"/>
               </w:rPr>
-              <w:t xml:space="preserve"> </w:t>
+              <w:t xml:space="preserve"> </w:t>
             </w:r>
             <w:r>
               <w:rPr>
@@ -10563,7 +10563,7 @@
               <w:rPr>
                 <w:u w:val="single"/>
               </w:rPr>
-              <w:t xml:space="preserve"> </w:t>
+              <w:t xml:space="preserve"> </w:t>
             </w:r>
             <w:r>
               <w:rPr>

</xml_diff>